<commit_message>
Requirement Tables added as Doc
</commit_message>
<xml_diff>
--- a/Docs/REQ&MOCKUP.docx
+++ b/Docs/REQ&MOCKUP.docx
@@ -4720,8 +4720,140 @@
           <w:szCs w:val="46"/>
         </w:rPr>
       </w:pPr>
-      <w:bookmarkStart w:colFirst="0" w:colLast="0" w:name="_6771lk2bgf3s" w:id="21"/>
+      <w:bookmarkStart w:colFirst="0" w:colLast="0" w:name="_6ealn59gjcs9" w:id="21"/>
       <w:bookmarkEnd w:id="21"/>
+      <w:r>
+        <w:rPr>
+          <w:rtl w:val="0"/>
+        </w:rPr>
+      </w:r>
+    </w:p>
+    <w:p>
+      <w:pPr>
+        <w:pStyle w:val="Heading1"/>
+        <w:keepNext w:val="0"/>
+        <w:keepLines w:val="0"/>
+        <w:spacing w:before="480" w:lineRule="auto"/>
+        <w:rPr>
+          <w:rFonts w:ascii="Roboto" w:cs="Roboto" w:eastAsia="Roboto" w:hAnsi="Roboto"/>
+          <w:b w:val="1"/>
+          <w:bCs w:val="1"/>
+          <w:sz w:val="46"/>
+          <w:szCs w:val="46"/>
+        </w:rPr>
+      </w:pPr>
+      <w:bookmarkStart w:colFirst="0" w:colLast="0" w:name="_wwen2olu7soi" w:id="22"/>
+      <w:bookmarkEnd w:id="22"/>
+      <w:r>
+        <w:rPr>
+          <w:rtl w:val="0"/>
+        </w:rPr>
+      </w:r>
+    </w:p>
+    <w:p>
+      <w:pPr>
+        <w:pStyle w:val="Heading1"/>
+        <w:keepNext w:val="0"/>
+        <w:keepLines w:val="0"/>
+        <w:spacing w:before="480" w:lineRule="auto"/>
+        <w:rPr>
+          <w:rFonts w:ascii="Roboto" w:cs="Roboto" w:eastAsia="Roboto" w:hAnsi="Roboto"/>
+          <w:b w:val="1"/>
+          <w:bCs w:val="1"/>
+          <w:sz w:val="46"/>
+          <w:szCs w:val="46"/>
+        </w:rPr>
+      </w:pPr>
+      <w:bookmarkStart w:colFirst="0" w:colLast="0" w:name="_cccllovr6viv" w:id="23"/>
+      <w:bookmarkEnd w:id="23"/>
+      <w:r>
+        <w:rPr>
+          <w:rtl w:val="0"/>
+        </w:rPr>
+      </w:r>
+    </w:p>
+    <w:p>
+      <w:pPr>
+        <w:pStyle w:val="Heading1"/>
+        <w:keepNext w:val="0"/>
+        <w:keepLines w:val="0"/>
+        <w:spacing w:before="480" w:lineRule="auto"/>
+        <w:rPr>
+          <w:rFonts w:ascii="Roboto" w:cs="Roboto" w:eastAsia="Roboto" w:hAnsi="Roboto"/>
+          <w:b w:val="1"/>
+          <w:bCs w:val="1"/>
+          <w:sz w:val="46"/>
+          <w:szCs w:val="46"/>
+        </w:rPr>
+      </w:pPr>
+      <w:bookmarkStart w:colFirst="0" w:colLast="0" w:name="_6lox4k673hum" w:id="24"/>
+      <w:bookmarkEnd w:id="24"/>
+      <w:r>
+        <w:rPr>
+          <w:rtl w:val="0"/>
+        </w:rPr>
+      </w:r>
+    </w:p>
+    <w:p>
+      <w:pPr>
+        <w:pStyle w:val="Heading1"/>
+        <w:keepNext w:val="0"/>
+        <w:keepLines w:val="0"/>
+        <w:spacing w:before="480" w:lineRule="auto"/>
+        <w:rPr>
+          <w:rFonts w:ascii="Roboto" w:cs="Roboto" w:eastAsia="Roboto" w:hAnsi="Roboto"/>
+          <w:b w:val="1"/>
+          <w:bCs w:val="1"/>
+          <w:sz w:val="46"/>
+          <w:szCs w:val="46"/>
+        </w:rPr>
+      </w:pPr>
+      <w:bookmarkStart w:colFirst="0" w:colLast="0" w:name="_z6l3mrzgqiqz" w:id="25"/>
+      <w:bookmarkEnd w:id="25"/>
+      <w:r>
+        <w:rPr>
+          <w:rtl w:val="0"/>
+        </w:rPr>
+      </w:r>
+    </w:p>
+    <w:p>
+      <w:pPr>
+        <w:pStyle w:val="Heading1"/>
+        <w:keepNext w:val="0"/>
+        <w:keepLines w:val="0"/>
+        <w:spacing w:before="480" w:lineRule="auto"/>
+        <w:rPr>
+          <w:rFonts w:ascii="Roboto" w:cs="Roboto" w:eastAsia="Roboto" w:hAnsi="Roboto"/>
+          <w:b w:val="1"/>
+          <w:bCs w:val="1"/>
+          <w:sz w:val="46"/>
+          <w:szCs w:val="46"/>
+        </w:rPr>
+      </w:pPr>
+      <w:bookmarkStart w:colFirst="0" w:colLast="0" w:name="_au0wansgiwoo" w:id="26"/>
+      <w:bookmarkEnd w:id="26"/>
+      <w:r>
+        <w:rPr>
+          <w:rtl w:val="0"/>
+        </w:rPr>
+      </w:r>
+    </w:p>
+    <w:p>
+      <w:pPr>
+        <w:pStyle w:val="Heading1"/>
+        <w:keepNext w:val="0"/>
+        <w:keepLines w:val="0"/>
+        <w:spacing w:before="480" w:lineRule="auto"/>
+        <w:rPr>
+          <w:rFonts w:ascii="Roboto" w:cs="Roboto" w:eastAsia="Roboto" w:hAnsi="Roboto"/>
+          <w:b w:val="1"/>
+          <w:bCs w:val="1"/>
+          <w:sz w:val="46"/>
+          <w:szCs w:val="46"/>
+        </w:rPr>
+      </w:pPr>
+      <w:bookmarkStart w:colFirst="0" w:colLast="0" w:name="_6771lk2bgf3s" w:id="27"/>
+      <w:bookmarkEnd w:id="27"/>
       <w:r>
         <w:rPr>
           <w:rFonts w:ascii="Roboto" w:cs="Roboto" w:eastAsia="Roboto" w:hAnsi="Roboto"/>

</xml_diff>